<commit_message>
Pedidos de interdição: bloqueio a partir das 12h de 29/10/2026
Co-Authored-By: Claude Opus 5.5 <noreply@anthropic.com>
Claude-Session: https://claude.ai/code/session_01Xsu4psjqdzYnCKVsDP2B5y
</commit_message>
<xml_diff>
--- a/Alvará evento 30-10-2026 - Ronaldo de Lima Barbosa/Pedido de interdição ao DER-PI - evento 30-10-2026.docx
+++ b/Alvará evento 30-10-2026 - Ronaldo de Lima Barbosa/Pedido de interdição ao DER-PI - evento 30-10-2026.docx
@@ -31,7 +31,7 @@
           <w:b/>
           <w:bCs/>
         </w:rPr>
-        <w:t xml:space="preserve">URGENTE – INTERDIÇÃO A PARTIR DE 30/10/2026.</w:t>
+        <w:t xml:space="preserve">URGENTE – INTERDIÇÃO A PARTIR DAS 12H00 DE HOJE (29/10/2026).</w:t>
       </w:r>
     </w:p>
     <w:p>
@@ -253,18 +253,7 @@
         <w:t xml:space="preserve">Interdição necessária:</w:t>
       </w:r>
       <w:r>
-        <w:t xml:space="preserve"> das </w:t>
-      </w:r>
-      <w:r>
-        <w:rPr>
-          <w:b/>
-          <w:bCs/>
-          <w:shd w:fill="FFF200" w:color="auto" w:val="clear"/>
-        </w:rPr>
-        <w:t xml:space="preserve">[07h00]</w:t>
-      </w:r>
-      <w:r>
-        <w:t xml:space="preserve"> de 30/10/2026 até a retirada do palco, às 14h00 de 31/10/2026, abrangendo a montagem do palco, o evento e a desmontagem.</w:t>
+        <w:t xml:space="preserve"> a partir das 12h00 de hoje, 29/10/2026, até a retirada do palco, às 14h00 de 31/10/2026, abrangendo a montagem do palco, o evento e a desmontagem.</w:t>
       </w:r>
     </w:p>
     <w:p>
@@ -434,7 +423,7 @@
         <w:jc w:val="both"/>
       </w:pPr>
       <w:r>
-        <w:t xml:space="preserve">O evento comemora resultado eleitoral conhecido apenas em 25/10/2026, o que impediu requerimento com maior antecedência. Considerando que o bloqueio se inicia na manhã de 30/10/2026, requer-se </w:t>
+        <w:t xml:space="preserve">O evento comemora resultado eleitoral conhecido apenas em 25/10/2026, o que impediu requerimento com maior antecedência. Considerando que o bloqueio se inicia às 12h00 de hoje, 29/10/2026, para a montagem da estrutura, requer-se </w:t>
       </w:r>
       <w:r>
         <w:rPr>
@@ -512,18 +501,7 @@
         <w:t xml:space="preserve">[___]</w:t>
       </w:r>
       <w:r>
-        <w:t xml:space="preserve"> (Avenida Marcos Furtado) em frente ao Estádio Municipal Enéas Torres Filho, das </w:t>
-      </w:r>
-      <w:r>
-        <w:rPr>
-          <w:b/>
-          <w:bCs/>
-          <w:shd w:fill="FFF200" w:color="auto" w:val="clear"/>
-        </w:rPr>
-        <w:t xml:space="preserve">[07h00]</w:t>
-      </w:r>
-      <w:r>
-        <w:t xml:space="preserve"> de 30/10/2026 até a retirada do palco, às 14h00 de 31/10/2026, com desvio do tráfego pelas vias adjacentes;</w:t>
+        <w:t xml:space="preserve"> (Avenida Marcos Furtado) em frente ao Estádio Municipal Enéas Torres Filho, a partir das 12h00 de hoje, 29/10/2026, até a retirada do palco, às 14h00 de 31/10/2026, com desvio do tráfego pelas vias adjacentes;</w:t>
       </w:r>
     </w:p>
     <w:p>
@@ -591,7 +569,7 @@
         <w:t xml:space="preserve">regime de urgência</w:t>
       </w:r>
       <w:r>
-        <w:t xml:space="preserve">, com decisão comunicada até a manhã de 30/10/2026;</w:t>
+        <w:t xml:space="preserve">, com decisão comunicada ainda na manhã de hoje, 29/10/2026;</w:t>
       </w:r>
     </w:p>
     <w:p>

</xml_diff>

<commit_message>
Pedidos de interdição: identifica a rodovia como PI-112
Co-Authored-By: Claude Opus 5.5 <noreply@anthropic.com>
Claude-Session: https://claude.ai/code/session_01Xsu4psjqdzYnCKVsDP2B5y
</commit_message>
<xml_diff>
--- a/Alvará evento 30-10-2026 - Ronaldo de Lima Barbosa/Pedido de interdição ao DER-PI - evento 30-10-2026.docx
+++ b/Alvará evento 30-10-2026 - Ronaldo de Lima Barbosa/Pedido de interdição ao DER-PI - evento 30-10-2026.docx
@@ -150,18 +150,7 @@
         <w:t xml:space="preserve">Local:</w:t>
       </w:r>
       <w:r>
-        <w:t xml:space="preserve"> Avenida Marcos Furtado, trecho urbano da rodovia estadual PI-</w:t>
-      </w:r>
-      <w:r>
-        <w:rPr>
-          <w:b/>
-          <w:bCs/>
-          <w:shd w:fill="FFF200" w:color="auto" w:val="clear"/>
-        </w:rPr>
-        <w:t xml:space="preserve">[___]</w:t>
-      </w:r>
-      <w:r>
-        <w:t xml:space="preserve">, em frente ao Estádio Municipal Enéas Torres Filho (“O Torrão”), Miguel Alves-PI (Plus Code R493+M8);</w:t>
+        <w:t xml:space="preserve"> Avenida Marcos Furtado, trecho urbano da rodovia estadual PI-112, em frente ao Estádio Municipal Enéas Torres Filho (“O Torrão”), Miguel Alves-PI (Plus Code R493+M8);</w:t>
       </w:r>
     </w:p>
     <w:p>
@@ -359,18 +348,7 @@
         <w:jc w:val="both"/>
       </w:pPr>
       <w:r>
-        <w:t xml:space="preserve">A Avenida Marcos Furtado, no trecho em frente ao estádio, é trecho urbano da rodovia estadual PI-</w:t>
-      </w:r>
-      <w:r>
-        <w:rPr>
-          <w:b/>
-          <w:bCs/>
-          <w:shd w:fill="FFF200" w:color="auto" w:val="clear"/>
-        </w:rPr>
-        <w:t xml:space="preserve">[___]</w:t>
-      </w:r>
-      <w:r>
-        <w:t xml:space="preserve">. Sobre as rodovias estaduais, a circunscrição é do órgão executivo rodoviário do Estado, a quem compete planejar, regulamentar e operar o trânsito (art. 21, I e II, do CTB). Assim, </w:t>
+        <w:t xml:space="preserve">A Avenida Marcos Furtado, no trecho em frente ao estádio, é trecho urbano da rodovia estadual PI-112. Sobre as rodovias estaduais, a circunscrição é do órgão executivo rodoviário do Estado, a quem compete planejar, regulamentar e operar o trânsito (art. 21, I e II, do CTB). Assim, </w:t>
       </w:r>
       <w:r>
         <w:rPr>
@@ -490,18 +468,7 @@
         <w:t xml:space="preserve">autorização para interdição total</w:t>
       </w:r>
       <w:r>
-        <w:t xml:space="preserve"> do trecho da rodovia PI-</w:t>
-      </w:r>
-      <w:r>
-        <w:rPr>
-          <w:b/>
-          <w:bCs/>
-          <w:shd w:fill="FFF200" w:color="auto" w:val="clear"/>
-        </w:rPr>
-        <w:t xml:space="preserve">[___]</w:t>
-      </w:r>
-      <w:r>
-        <w:t xml:space="preserve"> (Avenida Marcos Furtado) em frente ao Estádio Municipal Enéas Torres Filho, a partir das 12h00 de hoje, 29/10/2026, até a retirada do palco, às 14h00 de 31/10/2026, com desvio do tráfego pelas vias adjacentes;</w:t>
+        <w:t xml:space="preserve"> do trecho da rodovia PI-112 (Avenida Marcos Furtado) em frente ao Estádio Municipal Enéas Torres Filho, a partir das 12h00 de hoje, 29/10/2026, até a retirada do palco, às 14h00 de 31/10/2026, com desvio do tráfego pelas vias adjacentes;</w:t>
       </w:r>
     </w:p>
     <w:p>

</xml_diff>